<commit_message>
Dar a la Tabla 1 el formato APA 7
La tabla se había construido con cuadrícula completa y encabezado
sombreado, que no corresponde a APA 7. Correcciones:

- Se eliminan todas las líneas verticales, exteriores e interiores, y las
  líneas entre las filas del cuerpo. Quedan solo las tres reglas
  horizontales: sobre los encabezados, bajo los encabezados y al cierre.
- Se retira el sombreado gris del encabezado.
- Los encabezados de columna pasan a ir centrados; el cuerpo queda
  alineado a la izquierda.
- La nota al pie usa "Nota." en cursiva y el resto en redonda.
- El rótulo mantiene el número en negrita y el título en cursiva en su
  propia línea, alineados a la izquierda.

Aplicado a la versión limpia y a la resaltada; en esta última se restituyó
el resaltado de la nota, que se había perdido al rehacer sus runs.

Co-Authored-By: Claude Opus 5 <noreply@anthropic.com>
Claude-Session: https://claude.ai/code/session_01ADxiYMGwj1KkCCXFvpQB39
</commit_message>
<xml_diff>
--- a/ARTICULO_AJUSTADO_v5.docx
+++ b/ARTICULO_AJUSTADO_v5.docx
@@ -395,12 +395,12 @@
         <w:tblLayout w:type="fixed"/>
         <w:tblLook w:firstColumn="1" w:firstRow="1" w:lastColumn="0" w:lastRow="0" w:noHBand="0" w:noVBand="1" w:val="04A0"/>
         <w:tblBorders>
-          <w:top w:val="single" w:sz="4" w:space="0" w:color="000000"/>
-          <w:left w:val="single" w:sz="4" w:space="0" w:color="000000"/>
-          <w:bottom w:val="single" w:sz="4" w:space="0" w:color="000000"/>
-          <w:right w:val="single" w:sz="4" w:space="0" w:color="000000"/>
-          <w:insideH w:val="single" w:sz="4" w:space="0" w:color="000000"/>
-          <w:insideV w:val="single" w:sz="4" w:space="0" w:color="000000"/>
+          <w:top w:val="single" w:sz="6" w:space="0" w:color="000000"/>
+          <w:left w:val="none"/>
+          <w:bottom w:val="single" w:sz="6" w:space="0" w:color="000000"/>
+          <w:right w:val="none"/>
+          <w:insideH w:val="none"/>
+          <w:insideV w:val="none"/>
         </w:tblBorders>
       </w:tblPr>
       <w:tblGrid>
@@ -413,9 +413,14 @@
         <w:tc>
           <w:tcPr>
             <w:tcW w:type="dxa" w:w="2608"/>
-            <w:shd w:val="clear" w:color="auto" w:fill="D9D9D9"/>
+            <w:tcBorders>
+              <w:bottom w:val="single" w:sz="6" w:space="0" w:color="000000"/>
+            </w:tcBorders>
           </w:tcPr>
           <w:p>
+            <w:pPr>
+              <w:jc w:val="center"/>
+            </w:pPr>
             <w:r/>
             <w:r>
               <w:rPr>
@@ -430,9 +435,14 @@
         <w:tc>
           <w:tcPr>
             <w:tcW w:type="dxa" w:w="2438"/>
-            <w:shd w:val="clear" w:color="auto" w:fill="D9D9D9"/>
+            <w:tcBorders>
+              <w:bottom w:val="single" w:sz="6" w:space="0" w:color="000000"/>
+            </w:tcBorders>
           </w:tcPr>
           <w:p>
+            <w:pPr>
+              <w:jc w:val="center"/>
+            </w:pPr>
             <w:r/>
             <w:r>
               <w:rPr>
@@ -447,9 +457,14 @@
         <w:tc>
           <w:tcPr>
             <w:tcW w:type="dxa" w:w="2211"/>
-            <w:shd w:val="clear" w:color="auto" w:fill="D9D9D9"/>
+            <w:tcBorders>
+              <w:bottom w:val="single" w:sz="6" w:space="0" w:color="000000"/>
+            </w:tcBorders>
           </w:tcPr>
           <w:p>
+            <w:pPr>
+              <w:jc w:val="center"/>
+            </w:pPr>
             <w:r/>
             <w:r>
               <w:rPr>
@@ -464,9 +479,14 @@
         <w:tc>
           <w:tcPr>
             <w:tcW w:type="dxa" w:w="2098"/>
-            <w:shd w:val="clear" w:color="auto" w:fill="D9D9D9"/>
+            <w:tcBorders>
+              <w:bottom w:val="single" w:sz="6" w:space="0" w:color="000000"/>
+            </w:tcBorders>
           </w:tcPr>
           <w:p>
+            <w:pPr>
+              <w:jc w:val="center"/>
+            </w:pPr>
             <w:r/>
             <w:r>
               <w:rPr>
@@ -851,9 +871,17 @@
       </w:pPr>
       <w:r>
         <w:rPr>
+          <w:i/>
           <w:sz w:val="18"/>
         </w:rPr>
-        <w:t xml:space="preserve">Nota. Elaboración propia a partir de las fuentes relacionadas en el apartado de referencias.</w:t>
+        <w:t>Nota.</w:t>
+      </w:r>
+      <w:r>
+        <w:rPr>
+          <w:i w:val="0"/>
+          <w:sz w:val="18"/>
+        </w:rPr>
+        <w:t xml:space="preserve"> Elaboración propia a partir de las fuentes relacionadas en el apartado de referencias.</w:t>
       </w:r>
     </w:p>
     <w:p>

</xml_diff>